<commit_message>
feat(kepegawaian): perbaiki impor DUK multi-halaman + resume status pegawai
Impor DUK PDF multi-halaman selalu menghasilkan 0 baris karena
`pdftotext -bbox` mereset koordinat Y per halaman, sementara
`extractWords()` membuang penanda halaman sehingga kata halaman 2+
bertabrakan dengan halaman 1. Batch 0 baris pun tetap tersimpan,
membuat halaman DUK default tampak kosong.

- DukImportService: simpan nomor halaman per kata, pisah baris saat
  pindah halaman, kelompokkan blok record per jarak vertikal (header
  tabel berulang & NO wrap ditangani), tolak impor 0 baris, normalkan
  golongan "IV/ b" -> "IV/b"
- DukPage: query pakai closure agar batch terpilih langsung berlaku,
  reset page saat ganti periode, lewati batch kosong saat memilih
  default, cast int (perbaiki TypeError 500)
- Pegawai: widget resume jumlah per status (PNS/PPPK/PPPK Paruh Waktu)
  di atas tabel, tiap kartu memfilter tabel via query param
- Arsip/Surat Pengantar/DRH: penyesuaian form, generator, dan controller
</commit_message>
<xml_diff>
--- a/src/resources/templates/kepegawaian/drh-satya-lancana.docx
+++ b/src/resources/templates/kepegawaian/drh-satya-lancana.docx
@@ -360,7 +360,7 @@
           </w:tcPr>
           <w:p>
             <w:pPr>
-              <w:spacing w:before="60"/>
+              <w:spacing w:before="60" w:after="20"/>
               <w:jc w:val="center"/>
               <w:rPr>
                 <w:rFonts w:ascii="Arial" w:eastAsia="Times New Roman" w:hAnsi="Arial" w:cs="Arial"/>
@@ -387,7 +387,7 @@
           </w:tcPr>
           <w:p>
             <w:pPr>
-              <w:spacing w:before="60"/>
+              <w:spacing w:before="60" w:after="20"/>
               <w:ind w:left="80"/>
               <w:rPr>
                 <w:rFonts w:ascii="Arial" w:eastAsia="Times New Roman" w:hAnsi="Arial" w:cs="Arial"/>
@@ -414,7 +414,7 @@
           </w:tcPr>
           <w:p>
             <w:pPr>
-              <w:spacing w:before="60"/>
+              <w:spacing w:before="60" w:after="20"/>
               <w:rPr>
                 <w:rFonts w:ascii="Arial" w:eastAsia="Times New Roman" w:hAnsi="Arial" w:cs="Arial"/>
                 <w:sz w:val="22"/>
@@ -440,7 +440,7 @@
           </w:tcPr>
           <w:p>
             <w:pPr>
-              <w:spacing w:before="60"/>
+              <w:spacing w:before="60" w:after="20"/>
               <w:ind w:left="0"/>
               <w:rPr>
                 <w:rFonts w:ascii="Arial" w:eastAsia="Times New Roman" w:hAnsi="Arial" w:cs="Arial"/>
@@ -471,7 +471,7 @@
           </w:tcPr>
           <w:p>
             <w:pPr>
-              <w:spacing w:before="60"/>
+              <w:spacing w:before="60" w:after="20"/>
               <w:jc w:val="center"/>
               <w:rPr>
                 <w:rFonts w:ascii="Arial" w:eastAsia="Times New Roman" w:hAnsi="Arial" w:cs="Arial"/>
@@ -498,7 +498,7 @@
           </w:tcPr>
           <w:p>
             <w:pPr>
-              <w:spacing w:before="60"/>
+              <w:spacing w:before="60" w:after="20"/>
               <w:ind w:left="80"/>
               <w:rPr>
                 <w:rFonts w:ascii="Arial" w:eastAsia="Times New Roman" w:hAnsi="Arial" w:cs="Arial"/>
@@ -525,7 +525,7 @@
           </w:tcPr>
           <w:p>
             <w:pPr>
-              <w:spacing w:before="60"/>
+              <w:spacing w:before="60" w:after="20"/>
               <w:rPr>
                 <w:rFonts w:ascii="Arial" w:eastAsia="Times New Roman" w:hAnsi="Arial" w:cs="Arial"/>
                 <w:sz w:val="22"/>
@@ -551,7 +551,7 @@
           </w:tcPr>
           <w:p>
             <w:pPr>
-              <w:spacing w:before="60"/>
+              <w:spacing w:before="60" w:after="20"/>
               <w:ind w:left="0"/>
               <w:rPr>
                 <w:rFonts w:ascii="Arial" w:eastAsia="Times New Roman" w:hAnsi="Arial" w:cs="Arial"/>
@@ -580,7 +580,7 @@
           </w:tcPr>
           <w:p>
             <w:pPr>
-              <w:spacing w:before="60"/>
+              <w:spacing w:before="60" w:after="20"/>
               <w:jc w:val="center"/>
               <w:rPr>
                 <w:rFonts w:ascii="Arial" w:eastAsia="Times New Roman" w:hAnsi="Arial" w:cs="Arial"/>
@@ -607,7 +607,7 @@
           </w:tcPr>
           <w:p>
             <w:pPr>
-              <w:spacing w:before="60"/>
+              <w:spacing w:before="60" w:after="20"/>
               <w:ind w:left="80"/>
               <w:rPr>
                 <w:rFonts w:ascii="Arial" w:eastAsia="Times New Roman" w:hAnsi="Arial" w:cs="Arial"/>
@@ -634,7 +634,7 @@
           </w:tcPr>
           <w:p>
             <w:pPr>
-              <w:spacing w:before="60"/>
+              <w:spacing w:before="60" w:after="20"/>
               <w:rPr>
                 <w:rFonts w:ascii="Arial" w:eastAsia="Times New Roman" w:hAnsi="Arial" w:cs="Arial"/>
                 <w:sz w:val="22"/>
@@ -660,7 +660,7 @@
           </w:tcPr>
           <w:p>
             <w:pPr>
-              <w:spacing w:before="60"/>
+              <w:spacing w:before="60" w:after="20"/>
               <w:ind w:left="0"/>
               <w:rPr>
                 <w:rFonts w:ascii="Arial" w:eastAsia="Times New Roman" w:hAnsi="Arial" w:cs="Arial"/>
@@ -689,7 +689,7 @@
           </w:tcPr>
           <w:p>
             <w:pPr>
-              <w:spacing w:before="60"/>
+              <w:spacing w:before="60" w:after="20"/>
               <w:jc w:val="center"/>
               <w:rPr>
                 <w:rFonts w:ascii="Arial" w:eastAsia="Times New Roman" w:hAnsi="Arial" w:cs="Arial"/>
@@ -716,7 +716,7 @@
           </w:tcPr>
           <w:p>
             <w:pPr>
-              <w:spacing w:before="60"/>
+              <w:spacing w:before="60" w:after="20"/>
               <w:ind w:left="80"/>
               <w:rPr>
                 <w:rFonts w:ascii="Arial" w:eastAsia="Times New Roman" w:hAnsi="Arial" w:cs="Arial"/>
@@ -743,7 +743,7 @@
           </w:tcPr>
           <w:p>
             <w:pPr>
-              <w:spacing w:before="60"/>
+              <w:spacing w:before="60" w:after="20"/>
               <w:rPr>
                 <w:rFonts w:ascii="Arial" w:eastAsia="Times New Roman" w:hAnsi="Arial" w:cs="Arial"/>
                 <w:sz w:val="22"/>
@@ -769,7 +769,7 @@
           </w:tcPr>
           <w:p>
             <w:pPr>
-              <w:spacing w:before="60"/>
+              <w:spacing w:before="60" w:after="20"/>
               <w:ind w:left="0"/>
               <w:rPr>
                 <w:rFonts w:ascii="Arial" w:eastAsia="Times New Roman" w:hAnsi="Arial" w:cs="Arial"/>
@@ -798,7 +798,7 @@
           </w:tcPr>
           <w:p>
             <w:pPr>
-              <w:spacing w:before="60"/>
+              <w:spacing w:before="60" w:after="20"/>
               <w:jc w:val="center"/>
               <w:rPr>
                 <w:rFonts w:ascii="Arial" w:eastAsia="Times New Roman" w:hAnsi="Arial" w:cs="Arial"/>
@@ -825,7 +825,7 @@
           </w:tcPr>
           <w:p>
             <w:pPr>
-              <w:spacing w:before="60"/>
+              <w:spacing w:before="60" w:after="20"/>
               <w:ind w:left="80"/>
               <w:rPr>
                 <w:rFonts w:ascii="Arial" w:eastAsia="Times New Roman" w:hAnsi="Arial" w:cs="Arial"/>
@@ -852,7 +852,7 @@
           </w:tcPr>
           <w:p>
             <w:pPr>
-              <w:spacing w:before="60"/>
+              <w:spacing w:before="60" w:after="20"/>
               <w:rPr>
                 <w:rFonts w:ascii="Arial" w:eastAsia="Times New Roman" w:hAnsi="Arial" w:cs="Arial"/>
                 <w:sz w:val="22"/>
@@ -878,7 +878,7 @@
           </w:tcPr>
           <w:p>
             <w:pPr>
-              <w:spacing w:before="60"/>
+              <w:spacing w:before="60" w:after="20"/>
               <w:ind w:left="0"/>
               <w:rPr>
                 <w:rFonts w:ascii="Arial" w:eastAsia="Times New Roman" w:hAnsi="Arial" w:cs="Arial"/>
@@ -907,7 +907,7 @@
           </w:tcPr>
           <w:p>
             <w:pPr>
-              <w:spacing w:before="60"/>
+              <w:spacing w:before="60" w:after="20"/>
               <w:jc w:val="center"/>
               <w:rPr>
                 <w:rFonts w:ascii="Arial" w:eastAsia="Times New Roman" w:hAnsi="Arial" w:cs="Arial"/>
@@ -934,7 +934,7 @@
           </w:tcPr>
           <w:p>
             <w:pPr>
-              <w:spacing w:before="60"/>
+              <w:spacing w:before="60" w:after="20"/>
               <w:ind w:left="80"/>
               <w:rPr>
                 <w:rFonts w:ascii="Arial" w:eastAsia="Times New Roman" w:hAnsi="Arial" w:cs="Arial"/>
@@ -979,7 +979,7 @@
           </w:tcPr>
           <w:p>
             <w:pPr>
-              <w:spacing w:before="60"/>
+              <w:spacing w:before="60" w:after="20"/>
               <w:rPr>
                 <w:rFonts w:ascii="Arial" w:eastAsia="Times New Roman" w:hAnsi="Arial" w:cs="Arial"/>
                 <w:sz w:val="22"/>
@@ -1005,7 +1005,7 @@
           </w:tcPr>
           <w:p>
             <w:pPr>
-              <w:spacing w:before="60"/>
+              <w:spacing w:before="60" w:after="20"/>
               <w:ind w:left="0"/>
               <w:rPr>
                 <w:rFonts w:ascii="Arial" w:eastAsia="Times New Roman" w:hAnsi="Arial" w:cs="Arial"/>
@@ -1034,7 +1034,7 @@
           </w:tcPr>
           <w:p>
             <w:pPr>
-              <w:spacing w:before="60"/>
+              <w:spacing w:before="60" w:after="20"/>
               <w:jc w:val="center"/>
               <w:rPr>
                 <w:rFonts w:ascii="Arial" w:eastAsia="Times New Roman" w:hAnsi="Arial" w:cs="Arial"/>
@@ -1061,7 +1061,7 @@
           </w:tcPr>
           <w:p>
             <w:pPr>
-              <w:spacing w:before="60"/>
+              <w:spacing w:before="60" w:after="20"/>
               <w:ind w:left="80"/>
               <w:rPr>
                 <w:rFonts w:ascii="Arial" w:eastAsia="Times New Roman" w:hAnsi="Arial" w:cs="Arial"/>
@@ -1088,7 +1088,7 @@
           </w:tcPr>
           <w:p>
             <w:pPr>
-              <w:spacing w:before="60"/>
+              <w:spacing w:before="60" w:after="20"/>
               <w:rPr>
                 <w:rFonts w:ascii="Arial" w:eastAsia="Times New Roman" w:hAnsi="Arial" w:cs="Arial"/>
                 <w:sz w:val="22"/>
@@ -1114,7 +1114,7 @@
           </w:tcPr>
           <w:p>
             <w:pPr>
-              <w:spacing w:before="60"/>
+              <w:spacing w:before="60" w:after="20"/>
               <w:ind w:left="0"/>
               <w:rPr>
                 <w:rFonts w:ascii="Arial" w:eastAsia="Times New Roman" w:hAnsi="Arial" w:cs="Arial"/>
@@ -1215,7 +1215,7 @@
           </w:tcPr>
           <w:p>
             <w:pPr>
-              <w:spacing w:before="60"/>
+              <w:spacing w:before="60" w:after="20"/>
               <w:jc w:val="center"/>
               <w:rPr>
                 <w:rFonts w:ascii="Arial" w:eastAsia="Times New Roman" w:hAnsi="Arial" w:cs="Arial"/>
@@ -1242,7 +1242,7 @@
           </w:tcPr>
           <w:p>
             <w:pPr>
-              <w:spacing w:before="60"/>
+              <w:spacing w:before="60" w:after="20"/>
               <w:ind w:left="80"/>
               <w:rPr>
                 <w:rFonts w:ascii="Arial" w:eastAsia="Times New Roman" w:hAnsi="Arial" w:cs="Arial"/>
@@ -1269,7 +1269,7 @@
           </w:tcPr>
           <w:p>
             <w:pPr>
-              <w:spacing w:before="60"/>
+              <w:spacing w:before="60" w:after="20"/>
               <w:rPr>
                 <w:rFonts w:ascii="Arial" w:eastAsia="Times New Roman" w:hAnsi="Arial" w:cs="Arial"/>
                 <w:sz w:val="22"/>
@@ -1295,7 +1295,7 @@
           </w:tcPr>
           <w:p>
             <w:pPr>
-              <w:spacing w:before="60"/>
+              <w:spacing w:before="60" w:after="20"/>
               <w:ind w:left="0"/>
               <w:rPr>
                 <w:rFonts w:ascii="Arial" w:eastAsia="Times New Roman" w:hAnsi="Arial" w:cs="Arial"/>
@@ -1396,7 +1396,7 @@
           </w:tcPr>
           <w:p>
             <w:pPr>
-              <w:spacing w:before="60"/>
+              <w:spacing w:before="60" w:after="20"/>
               <w:jc w:val="center"/>
               <w:rPr>
                 <w:rFonts w:ascii="Arial" w:eastAsia="Times New Roman" w:hAnsi="Arial" w:cs="Arial"/>
@@ -1423,7 +1423,7 @@
           </w:tcPr>
           <w:p>
             <w:pPr>
-              <w:spacing w:before="60"/>
+              <w:spacing w:before="60" w:after="20"/>
               <w:ind w:left="80"/>
               <w:rPr>
                 <w:rFonts w:ascii="Arial" w:eastAsia="Times New Roman" w:hAnsi="Arial" w:cs="Arial"/>
@@ -1450,7 +1450,7 @@
           </w:tcPr>
           <w:p>
             <w:pPr>
-              <w:spacing w:before="60"/>
+              <w:spacing w:before="60" w:after="20"/>
               <w:rPr>
                 <w:rFonts w:ascii="Arial" w:eastAsia="Times New Roman" w:hAnsi="Arial" w:cs="Arial"/>
                 <w:sz w:val="22"/>
@@ -1476,7 +1476,7 @@
           </w:tcPr>
           <w:p>
             <w:pPr>
-              <w:spacing w:before="60"/>
+              <w:spacing w:before="60" w:after="20"/>
               <w:ind w:left="0"/>
               <w:rPr>
                 <w:rFonts w:ascii="Arial" w:eastAsia="Times New Roman" w:hAnsi="Arial" w:cs="Arial"/>
@@ -1505,7 +1505,7 @@
           </w:tcPr>
           <w:p>
             <w:pPr>
-              <w:spacing w:before="60"/>
+              <w:spacing w:before="60" w:after="20"/>
               <w:jc w:val="center"/>
               <w:rPr>
                 <w:rFonts w:ascii="Arial" w:eastAsia="Times New Roman" w:hAnsi="Arial" w:cs="Arial"/>
@@ -1532,7 +1532,7 @@
           </w:tcPr>
           <w:p>
             <w:pPr>
-              <w:spacing w:before="60"/>
+              <w:spacing w:before="60" w:after="20"/>
               <w:ind w:left="80"/>
               <w:rPr>
                 <w:rFonts w:ascii="Arial" w:eastAsia="Times New Roman" w:hAnsi="Arial" w:cs="Arial"/>
@@ -1577,7 +1577,7 @@
           </w:tcPr>
           <w:p>
             <w:pPr>
-              <w:spacing w:before="60"/>
+              <w:spacing w:before="60" w:after="20"/>
               <w:rPr>
                 <w:rFonts w:ascii="Arial" w:eastAsia="Times New Roman" w:hAnsi="Arial" w:cs="Arial"/>
                 <w:sz w:val="22"/>
@@ -1603,7 +1603,7 @@
           </w:tcPr>
           <w:p>
             <w:pPr>
-              <w:spacing w:before="60"/>
+              <w:spacing w:before="60" w:after="20"/>
               <w:ind w:left="0"/>
               <w:rPr>
                 <w:rFonts w:ascii="Arial" w:eastAsia="Times New Roman" w:hAnsi="Arial" w:cs="Arial"/>
@@ -1632,7 +1632,7 @@
           </w:tcPr>
           <w:p>
             <w:pPr>
-              <w:spacing w:before="60"/>
+              <w:spacing w:before="60" w:after="20"/>
               <w:jc w:val="center"/>
               <w:rPr>
                 <w:rFonts w:ascii="Arial" w:eastAsia="Times New Roman" w:hAnsi="Arial" w:cs="Arial"/>
@@ -1659,7 +1659,7 @@
           </w:tcPr>
           <w:p>
             <w:pPr>
-              <w:spacing w:before="60"/>
+              <w:spacing w:before="60" w:after="20"/>
               <w:ind w:left="80"/>
               <w:rPr>
                 <w:rFonts w:ascii="Arial" w:eastAsia="Times New Roman" w:hAnsi="Arial" w:cs="Arial"/>
@@ -1686,7 +1686,7 @@
           </w:tcPr>
           <w:p>
             <w:pPr>
-              <w:spacing w:before="60"/>
+              <w:spacing w:before="60" w:after="20"/>
               <w:rPr>
                 <w:rFonts w:ascii="Arial" w:eastAsia="Times New Roman" w:hAnsi="Arial" w:cs="Arial"/>
                 <w:sz w:val="22"/>
@@ -1712,7 +1712,7 @@
           </w:tcPr>
           <w:p>
             <w:pPr>
-              <w:spacing w:before="60"/>
+              <w:spacing w:before="60" w:after="20"/>
               <w:ind w:left="0"/>
               <w:rPr>
                 <w:rFonts w:ascii="Arial" w:eastAsia="Times New Roman" w:hAnsi="Arial" w:cs="Arial"/>
@@ -1741,7 +1741,7 @@
           </w:tcPr>
           <w:p>
             <w:pPr>
-              <w:spacing w:before="60"/>
+              <w:spacing w:before="60" w:after="20"/>
               <w:jc w:val="center"/>
               <w:rPr>
                 <w:rFonts w:ascii="Arial" w:eastAsia="Times New Roman" w:hAnsi="Arial" w:cs="Arial"/>
@@ -1768,7 +1768,7 @@
           </w:tcPr>
           <w:p>
             <w:pPr>
-              <w:spacing w:before="60"/>
+              <w:spacing w:before="60" w:after="20"/>
               <w:ind w:left="80"/>
               <w:rPr>
                 <w:rFonts w:ascii="Arial" w:eastAsia="Times New Roman" w:hAnsi="Arial" w:cs="Arial"/>
@@ -1795,7 +1795,7 @@
           </w:tcPr>
           <w:p>
             <w:pPr>
-              <w:spacing w:before="60"/>
+              <w:spacing w:before="60" w:after="20"/>
               <w:rPr>
                 <w:rFonts w:ascii="Arial" w:eastAsia="Times New Roman" w:hAnsi="Arial" w:cs="Arial"/>
                 <w:sz w:val="22"/>
@@ -1821,7 +1821,7 @@
           </w:tcPr>
           <w:p>
             <w:pPr>
-              <w:spacing w:before="60"/>
+              <w:spacing w:before="60" w:after="20"/>
               <w:ind w:left="0"/>
               <w:rPr>
                 <w:rFonts w:ascii="Arial" w:eastAsia="Times New Roman" w:hAnsi="Arial" w:cs="Arial"/>
@@ -1904,6 +1904,9 @@
         <w:t xml:space="preserve">${tanggal_ditetapkan}</w:t>
       </w:r>
     </w:p>
+    <w:p>
+      <w:pPr/>
+    </w:p>
     <w:tbl>
       <w:tblPr>
         <w:tblW w:w="9923" w:type="dxa"/>
@@ -1999,7 +2002,7 @@
       </w:tr>
       <w:tr>
         <w:trPr>
-          <w:trHeight w:val="1400"/>
+          <w:trHeight w:val="450"/>
         </w:trPr>
         <w:tc>
           <w:tcPr>
@@ -2031,18 +2034,14 @@
               <w:jc w:val="center"/>
               <w:rPr>
                 <w:rFonts w:ascii="Arial" w:eastAsia="Times New Roman" w:hAnsi="Arial" w:cs="Arial"/>
-                <w:b/>
-                <w:bCs/>
-                <w:sz w:val="22"/>
-                <w:szCs w:val="22"/>
-                <w:lang w:val="id-ID"/>
-              </w:rPr>
-            </w:pPr>
-            <w:r>
-              <w:rPr>
-                <w:rFonts w:ascii="Arial" w:eastAsia="Times New Roman" w:hAnsi="Arial" w:cs="Arial"/>
-                <w:b/>
-                <w:bCs/>
+                <w:sz w:val="22"/>
+                <w:szCs w:val="22"/>
+                <w:lang w:val="id-ID"/>
+              </w:rPr>
+            </w:pPr>
+            <w:r>
+              <w:rPr>
+                <w:rFonts w:ascii="Arial" w:eastAsia="Times New Roman" w:hAnsi="Arial" w:cs="Arial"/>
                 <w:sz w:val="22"/>
                 <w:szCs w:val="22"/>
                 <w:lang w:val="id-ID"/>
@@ -2081,18 +2080,14 @@
               <w:jc w:val="center"/>
               <w:rPr>
                 <w:rFonts w:ascii="Arial" w:eastAsia="Times New Roman" w:hAnsi="Arial" w:cs="Arial"/>
-                <w:b/>
-                <w:bCs/>
-                <w:sz w:val="22"/>
-                <w:szCs w:val="22"/>
-                <w:lang w:val="id-ID"/>
-              </w:rPr>
-            </w:pPr>
-            <w:r>
-              <w:rPr>
-                <w:rFonts w:ascii="Arial" w:eastAsia="Times New Roman" w:hAnsi="Arial" w:cs="Arial"/>
-                <w:b/>
-                <w:bCs/>
+                <w:sz w:val="22"/>
+                <w:szCs w:val="22"/>
+                <w:lang w:val="id-ID"/>
+              </w:rPr>
+            </w:pPr>
+            <w:r>
+              <w:rPr>
+                <w:rFonts w:ascii="Arial" w:eastAsia="Times New Roman" w:hAnsi="Arial" w:cs="Arial"/>
                 <w:sz w:val="22"/>
                 <w:szCs w:val="22"/>
                 <w:lang w:val="id-ID"/>

</xml_diff>